<commit_message>
feat: add undo/redo buttons to workspace navbar and fix top toolbar responsive layout
</commit_message>
<xml_diff>
--- a/JustCmul8_Synopsis .docx
+++ b/JustCmul8_Synopsis .docx
@@ -644,7 +644,7 @@
         <w:spacing w:before="80" w:after="80" w:line="360" w:lineRule="auto"/>
       </w:pPr>
       <w:r>
-        <w:t>The system is divided into 11 well-defined modules, each responsible for a distinct part of the platform:</w:t>
+        <w:t>The system is divided into 12 well-defined modules, each responsible for a distinct part of the platform:</w:t>
       </w:r>
     </w:p>
     <w:p/>
@@ -836,7 +836,7 @@
                 <w:sz w:val="20"/>
                 <w:szCs w:val="20"/>
               </w:rPr>
-              <w:t>User Authentication</w:t>
+              <w:t>Platform &amp; Data Layer</w:t>
             </w:r>
           </w:p>
         </w:tc>
@@ -864,7 +864,7 @@
                 <w:sz w:val="20"/>
                 <w:szCs w:val="20"/>
               </w:rPr>
-              <w:t>Secure login, signup, Google/GitHub OAuth, session protection</w:t>
+              <w:t>Secure login/signup (Google &amp; GitHub OAuth), session protection, project CRUD (create/save/rename/delete), cloud storage and user profile/settings — all via Supabase (Postgres + RLS)</w:t>
             </w:r>
           </w:p>
         </w:tc>
@@ -885,7 +885,7 @@
               <w:bottom w:val="single" w:sz="1" w:space="0" w:color="CCCCCC"/>
               <w:right w:val="single" w:sz="1" w:space="0" w:color="CCCCCC"/>
             </w:tcBorders>
-            <w:shd w:val="clear" w:color="auto" w:fill="F3F4F6"/>
+            <w:shd w:val="clear" w:color="auto" w:fill="FFFFFF"/>
             <w:tcMar>
               <w:top w:w="80" w:type="dxa"/>
               <w:left w:w="120" w:type="dxa"/>
@@ -902,7 +902,6 @@
                 <w:sz w:val="20"/>
                 <w:szCs w:val="20"/>
               </w:rPr>
-              <w:lastRenderedPageBreak/>
               <w:t>2</w:t>
             </w:r>
           </w:p>
@@ -916,7 +915,7 @@
               <w:bottom w:val="single" w:sz="1" w:space="0" w:color="CCCCCC"/>
               <w:right w:val="single" w:sz="1" w:space="0" w:color="CCCCCC"/>
             </w:tcBorders>
-            <w:shd w:val="clear" w:color="auto" w:fill="F3F4F6"/>
+            <w:shd w:val="clear" w:color="auto" w:fill="FFFFFF"/>
             <w:tcMar>
               <w:top w:w="80" w:type="dxa"/>
               <w:left w:w="120" w:type="dxa"/>
@@ -932,7 +931,7 @@
                 <w:sz w:val="20"/>
                 <w:szCs w:val="20"/>
               </w:rPr>
-              <w:t>Project Management</w:t>
+              <w:t>Visual Graph Editor</w:t>
             </w:r>
           </w:p>
         </w:tc>
@@ -945,7 +944,7 @@
               <w:bottom w:val="single" w:sz="1" w:space="0" w:color="CCCCCC"/>
               <w:right w:val="single" w:sz="1" w:space="0" w:color="CCCCCC"/>
             </w:tcBorders>
-            <w:shd w:val="clear" w:color="auto" w:fill="F3F4F6"/>
+            <w:shd w:val="clear" w:color="auto" w:fill="FFFFFF"/>
             <w:tcMar>
               <w:top w:w="80" w:type="dxa"/>
               <w:left w:w="120" w:type="dxa"/>
@@ -960,7 +959,7 @@
                 <w:sz w:val="20"/>
                 <w:szCs w:val="20"/>
               </w:rPr>
-              <w:t>Create, save, rename, delete simulation projects; cloud storage via Supabase</w:t>
+              <w:t>Drag-and-drop node canvas; 13 node types; real-time edge routing</w:t>
             </w:r>
           </w:p>
         </w:tc>
@@ -1027,7 +1026,7 @@
                 <w:sz w:val="20"/>
                 <w:szCs w:val="20"/>
               </w:rPr>
-              <w:t>Visual Graph Editor</w:t>
+              <w:t>Node Configuration Panel</w:t>
             </w:r>
           </w:p>
         </w:tc>
@@ -1055,7 +1054,7 @@
                 <w:sz w:val="20"/>
                 <w:szCs w:val="20"/>
               </w:rPr>
-              <w:t>Drag-and-drop node canvas; 13 node types; real-time edge routing</w:t>
+              <w:t>Set properties for each node — arrival rates, capacities, distributions, and cost parameters (resource rate, buffer holding cost, waiting-penalty cost) used for ROI analysis</w:t>
             </w:r>
           </w:p>
         </w:tc>
@@ -1076,7 +1075,7 @@
               <w:bottom w:val="single" w:sz="1" w:space="0" w:color="CCCCCC"/>
               <w:right w:val="single" w:sz="1" w:space="0" w:color="CCCCCC"/>
             </w:tcBorders>
-            <w:shd w:val="clear" w:color="auto" w:fill="F3F4F6"/>
+            <w:shd w:val="clear" w:color="auto" w:fill="FFFFFF"/>
             <w:tcMar>
               <w:top w:w="80" w:type="dxa"/>
               <w:left w:w="120" w:type="dxa"/>
@@ -1106,7 +1105,7 @@
               <w:bottom w:val="single" w:sz="1" w:space="0" w:color="CCCCCC"/>
               <w:right w:val="single" w:sz="1" w:space="0" w:color="CCCCCC"/>
             </w:tcBorders>
-            <w:shd w:val="clear" w:color="auto" w:fill="F3F4F6"/>
+            <w:shd w:val="clear" w:color="auto" w:fill="FFFFFF"/>
             <w:tcMar>
               <w:top w:w="80" w:type="dxa"/>
               <w:left w:w="120" w:type="dxa"/>
@@ -1122,7 +1121,7 @@
                 <w:sz w:val="20"/>
                 <w:szCs w:val="20"/>
               </w:rPr>
-              <w:t>Node Configuration Panel</w:t>
+              <w:t>Simulation Engine</w:t>
             </w:r>
           </w:p>
         </w:tc>
@@ -1135,7 +1134,7 @@
               <w:bottom w:val="single" w:sz="1" w:space="0" w:color="CCCCCC"/>
               <w:right w:val="single" w:sz="1" w:space="0" w:color="CCCCCC"/>
             </w:tcBorders>
-            <w:shd w:val="clear" w:color="auto" w:fill="F3F4F6"/>
+            <w:shd w:val="clear" w:color="auto" w:fill="FFFFFF"/>
             <w:tcMar>
               <w:top w:w="80" w:type="dxa"/>
               <w:left w:w="120" w:type="dxa"/>
@@ -1150,7 +1149,7 @@
                 <w:sz w:val="20"/>
                 <w:szCs w:val="20"/>
               </w:rPr>
-              <w:t>Set properties for each node arrival rates, capacities, distributions</w:t>
+              <w:t>Runs real Python SimPy in the browser via Pyodide WASM (Web Worker fallback); includes a live Python code inspector with one-click Jupyter Notebook (.ipynb) export for reproducibility</w:t>
             </w:r>
           </w:p>
         </w:tc>
@@ -1217,7 +1216,7 @@
                 <w:sz w:val="20"/>
                 <w:szCs w:val="20"/>
               </w:rPr>
-              <w:t>Simulation Engine</w:t>
+              <w:t>AI Assistant</w:t>
             </w:r>
           </w:p>
         </w:tc>
@@ -1245,7 +1244,7 @@
                 <w:sz w:val="20"/>
                 <w:szCs w:val="20"/>
               </w:rPr>
-              <w:t>Runs real Python SimPy in the browser via Pyodide WASM; Web Worker fallback</w:t>
+              <w:t>Type a description → Google Gemini generates the simulation graph automatically</w:t>
             </w:r>
           </w:p>
         </w:tc>
@@ -1266,7 +1265,7 @@
               <w:bottom w:val="single" w:sz="1" w:space="0" w:color="CCCCCC"/>
               <w:right w:val="single" w:sz="1" w:space="0" w:color="CCCCCC"/>
             </w:tcBorders>
-            <w:shd w:val="clear" w:color="auto" w:fill="F3F4F6"/>
+            <w:shd w:val="clear" w:color="auto" w:fill="FFFFFF"/>
             <w:tcMar>
               <w:top w:w="80" w:type="dxa"/>
               <w:left w:w="120" w:type="dxa"/>
@@ -1296,7 +1295,7 @@
               <w:bottom w:val="single" w:sz="1" w:space="0" w:color="CCCCCC"/>
               <w:right w:val="single" w:sz="1" w:space="0" w:color="CCCCCC"/>
             </w:tcBorders>
-            <w:shd w:val="clear" w:color="auto" w:fill="F3F4F6"/>
+            <w:shd w:val="clear" w:color="auto" w:fill="FFFFFF"/>
             <w:tcMar>
               <w:top w:w="80" w:type="dxa"/>
               <w:left w:w="120" w:type="dxa"/>
@@ -1312,7 +1311,7 @@
                 <w:sz w:val="20"/>
                 <w:szCs w:val="20"/>
               </w:rPr>
-              <w:t>AI Assistant</w:t>
+              <w:t>AI System Optimizer</w:t>
             </w:r>
           </w:p>
         </w:tc>
@@ -1325,7 +1324,7 @@
               <w:bottom w:val="single" w:sz="1" w:space="0" w:color="CCCCCC"/>
               <w:right w:val="single" w:sz="1" w:space="0" w:color="CCCCCC"/>
             </w:tcBorders>
-            <w:shd w:val="clear" w:color="auto" w:fill="F3F4F6"/>
+            <w:shd w:val="clear" w:color="auto" w:fill="FFFFFF"/>
             <w:tcMar>
               <w:top w:w="80" w:type="dxa"/>
               <w:left w:w="120" w:type="dxa"/>
@@ -1340,7 +1339,7 @@
                 <w:sz w:val="20"/>
                 <w:szCs w:val="20"/>
               </w:rPr>
-              <w:t>Type a description → Google Gemini generates the simulation graph automatically</w:t>
+              <w:t>After a run, the AI inspects bottlenecks (e.g. server utilization, queue wait times) and proposes a concrete fix (add capacity, reroute traffic) with a one-click "Apply Fix" that updates the graph</w:t>
             </w:r>
           </w:p>
         </w:tc>
@@ -1435,7 +1434,7 @@
                 <w:sz w:val="20"/>
                 <w:szCs w:val="20"/>
               </w:rPr>
-              <w:t>Live charts, utilization metrics, bottleneck detection, simulation logs</w:t>
+              <w:t>Live charts, utilization metrics, bottleneck detection, simulation logs, and a Cost &amp; ROI panel showing total system cost and return on any proposed change</w:t>
             </w:r>
           </w:p>
         </w:tc>
@@ -1456,7 +1455,7 @@
               <w:bottom w:val="single" w:sz="1" w:space="0" w:color="CCCCCC"/>
               <w:right w:val="single" w:sz="1" w:space="0" w:color="CCCCCC"/>
             </w:tcBorders>
-            <w:shd w:val="clear" w:color="auto" w:fill="F3F4F6"/>
+            <w:shd w:val="clear" w:color="auto" w:fill="FFFFFF"/>
             <w:tcMar>
               <w:top w:w="80" w:type="dxa"/>
               <w:left w:w="120" w:type="dxa"/>
@@ -1486,7 +1485,7 @@
               <w:bottom w:val="single" w:sz="1" w:space="0" w:color="CCCCCC"/>
               <w:right w:val="single" w:sz="1" w:space="0" w:color="CCCCCC"/>
             </w:tcBorders>
-            <w:shd w:val="clear" w:color="auto" w:fill="F3F4F6"/>
+            <w:shd w:val="clear" w:color="auto" w:fill="FFFFFF"/>
             <w:tcMar>
               <w:top w:w="80" w:type="dxa"/>
               <w:left w:w="120" w:type="dxa"/>
@@ -1502,7 +1501,7 @@
                 <w:sz w:val="20"/>
                 <w:szCs w:val="20"/>
               </w:rPr>
-              <w:t>Simulation Template Gallery</w:t>
+              <w:t>Monte Carlo &amp; Scenario Comparison</w:t>
             </w:r>
           </w:p>
         </w:tc>
@@ -1515,7 +1514,7 @@
               <w:bottom w:val="single" w:sz="1" w:space="0" w:color="CCCCCC"/>
               <w:right w:val="single" w:sz="1" w:space="0" w:color="CCCCCC"/>
             </w:tcBorders>
-            <w:shd w:val="clear" w:color="auto" w:fill="F3F4F6"/>
+            <w:shd w:val="clear" w:color="auto" w:fill="FFFFFF"/>
             <w:tcMar>
               <w:top w:w="80" w:type="dxa"/>
               <w:left w:w="120" w:type="dxa"/>
@@ -1530,7 +1529,7 @@
                 <w:sz w:val="20"/>
                 <w:szCs w:val="20"/>
               </w:rPr>
-              <w:t>6 domain types × starter graphs; click to pre-populate canvas</w:t>
+              <w:t>Run a simulation N times (20/50/100 iterations) to show 95% confidence-interval bands, plus side-by-side Baseline vs Optimized scenario comparison</w:t>
             </w:r>
           </w:p>
         </w:tc>
@@ -1597,7 +1596,7 @@
                 <w:sz w:val="20"/>
                 <w:szCs w:val="20"/>
               </w:rPr>
-              <w:t>Export &amp; Share Module</w:t>
+              <w:t>Digital Twin Animated Playback</w:t>
             </w:r>
           </w:p>
         </w:tc>
@@ -1625,7 +1624,7 @@
                 <w:sz w:val="20"/>
                 <w:szCs w:val="20"/>
               </w:rPr>
-              <w:t>Download graph as JSON, results as CSV, shareable read-only project link</w:t>
+              <w:t>Pixi.js-powered animated 2D playback of entities flowing through the system, with queue congestion highlighting and VCR-style Play/Pause/Speed/Step controls</w:t>
             </w:r>
           </w:p>
         </w:tc>
@@ -1646,7 +1645,7 @@
               <w:bottom w:val="single" w:sz="1" w:space="0" w:color="CCCCCC"/>
               <w:right w:val="single" w:sz="1" w:space="0" w:color="CCCCCC"/>
             </w:tcBorders>
-            <w:shd w:val="clear" w:color="auto" w:fill="F3F4F6"/>
+            <w:shd w:val="clear" w:color="auto" w:fill="FFFFFF"/>
             <w:tcMar>
               <w:top w:w="80" w:type="dxa"/>
               <w:left w:w="120" w:type="dxa"/>
@@ -1676,7 +1675,7 @@
               <w:bottom w:val="single" w:sz="1" w:space="0" w:color="CCCCCC"/>
               <w:right w:val="single" w:sz="1" w:space="0" w:color="CCCCCC"/>
             </w:tcBorders>
-            <w:shd w:val="clear" w:color="auto" w:fill="F3F4F6"/>
+            <w:shd w:val="clear" w:color="auto" w:fill="FFFFFF"/>
             <w:tcMar>
               <w:top w:w="80" w:type="dxa"/>
               <w:left w:w="120" w:type="dxa"/>
@@ -1692,7 +1691,7 @@
                 <w:sz w:val="20"/>
                 <w:szCs w:val="20"/>
               </w:rPr>
-              <w:t>User Profile &amp; Settings</w:t>
+              <w:t>Simulation Template Gallery</w:t>
             </w:r>
           </w:p>
         </w:tc>
@@ -1705,7 +1704,7 @@
               <w:bottom w:val="single" w:sz="1" w:space="0" w:color="CCCCCC"/>
               <w:right w:val="single" w:sz="1" w:space="0" w:color="CCCCCC"/>
             </w:tcBorders>
-            <w:shd w:val="clear" w:color="auto" w:fill="F3F4F6"/>
+            <w:shd w:val="clear" w:color="auto" w:fill="FFFFFF"/>
             <w:tcMar>
               <w:top w:w="80" w:type="dxa"/>
               <w:left w:w="120" w:type="dxa"/>
@@ -1720,7 +1719,7 @@
                 <w:sz w:val="20"/>
                 <w:szCs w:val="20"/>
               </w:rPr>
-              <w:t>Profile management, rename projects, change sim type, password update</w:t>
+              <w:t>6 domain types × starter graphs; click to pre-populate canvas</w:t>
             </w:r>
           </w:p>
         </w:tc>
@@ -1759,6 +1758,101 @@
                 <w:szCs w:val="20"/>
               </w:rPr>
               <w:t>11</w:t>
+            </w:r>
+          </w:p>
+        </w:tc>
+        <w:tc>
+          <w:tcPr>
+            <w:tcW w:w="2800" w:type="dxa"/>
+            <w:tcBorders>
+              <w:top w:val="single" w:sz="1" w:space="0" w:color="CCCCCC"/>
+              <w:left w:val="single" w:sz="1" w:space="0" w:color="CCCCCC"/>
+              <w:bottom w:val="single" w:sz="1" w:space="0" w:color="CCCCCC"/>
+              <w:right w:val="single" w:sz="1" w:space="0" w:color="CCCCCC"/>
+            </w:tcBorders>
+            <w:shd w:val="clear" w:color="auto" w:fill="FFFFFF"/>
+            <w:tcMar>
+              <w:top w:w="80" w:type="dxa"/>
+              <w:left w:w="120" w:type="dxa"/>
+              <w:bottom w:w="80" w:type="dxa"/>
+              <w:right w:w="120" w:type="dxa"/>
+            </w:tcMar>
+            <w:vAlign w:val="center"/>
+          </w:tcPr>
+          <w:p>
+            <w:r>
+              <w:rPr>
+                <w:color w:val="1A3C6E"/>
+                <w:sz w:val="20"/>
+                <w:szCs w:val="20"/>
+              </w:rPr>
+              <w:t>Executive Report &amp; Share Module</w:t>
+            </w:r>
+          </w:p>
+        </w:tc>
+        <w:tc>
+          <w:tcPr>
+            <w:tcW w:w="5960" w:type="dxa"/>
+            <w:tcBorders>
+              <w:top w:val="single" w:sz="1" w:space="0" w:color="CCCCCC"/>
+              <w:left w:val="single" w:sz="1" w:space="0" w:color="CCCCCC"/>
+              <w:bottom w:val="single" w:sz="1" w:space="0" w:color="CCCCCC"/>
+              <w:right w:val="single" w:sz="1" w:space="0" w:color="CCCCCC"/>
+            </w:tcBorders>
+            <w:shd w:val="clear" w:color="auto" w:fill="FFFFFF"/>
+            <w:tcMar>
+              <w:top w:w="80" w:type="dxa"/>
+              <w:left w:w="120" w:type="dxa"/>
+              <w:bottom w:w="80" w:type="dxa"/>
+              <w:right w:w="120" w:type="dxa"/>
+            </w:tcMar>
+            <w:vAlign w:val="center"/>
+          </w:tcPr>
+          <w:p>
+            <w:r>
+              <w:rPr>
+                <w:sz w:val="20"/>
+                <w:szCs w:val="20"/>
+              </w:rPr>
+              <w:t>One-click IEEE-style PDF report (AI-written executive summary, canvas snapshot, KPI tables, charts); also export graph as JSON, results as CSV, and a shareable read-only project link</w:t>
+            </w:r>
+          </w:p>
+        </w:tc>
+      </w:tr>
+      <w:tr>
+        <w:tblPrEx>
+          <w:tblCellMar>
+            <w:top w:w="0" w:type="dxa"/>
+            <w:bottom w:w="0" w:type="dxa"/>
+          </w:tblCellMar>
+        </w:tblPrEx>
+        <w:tc>
+          <w:tcPr>
+            <w:tcW w:w="600" w:type="dxa"/>
+            <w:tcBorders>
+              <w:top w:val="single" w:sz="1" w:space="0" w:color="CCCCCC"/>
+              <w:left w:val="single" w:sz="1" w:space="0" w:color="CCCCCC"/>
+              <w:bottom w:val="single" w:sz="1" w:space="0" w:color="CCCCCC"/>
+              <w:right w:val="single" w:sz="1" w:space="0" w:color="CCCCCC"/>
+            </w:tcBorders>
+            <w:shd w:val="clear" w:color="auto" w:fill="FFFFFF"/>
+            <w:tcMar>
+              <w:top w:w="80" w:type="dxa"/>
+              <w:left w:w="120" w:type="dxa"/>
+              <w:bottom w:w="80" w:type="dxa"/>
+              <w:right w:w="120" w:type="dxa"/>
+            </w:tcMar>
+            <w:vAlign w:val="center"/>
+          </w:tcPr>
+          <w:p>
+            <w:r>
+              <w:rPr>
+                <w:b/>
+                <w:bCs/>
+                <w:sz w:val="20"/>
+                <w:szCs w:val="20"/>
+              </w:rPr>
+              <w:t>12</w:t>
             </w:r>
           </w:p>
         </w:tc>

</xml_diff>